<commit_message>
Flip garden meaning drills to meaning-to-sentence writing.
Kids get the tip and write the original line; regenerate all unit garden A4 sheets and answers.

Co-authored-by: Cursor <cursoragent@cursor.com>
</commit_message>
<xml_diff>
--- a/printables/garden-answers/U1-garden-answers.docx
+++ b/printables/garden-answers/U1-garden-answers.docx
@@ -127,7 +127,21 @@
           <w:color w:val="E85D04"/>
           <w:sz w:val="24"/>
         </w:rPr>
-        <w:t>二、意思</w:t>
+        <w:t>二、根据意思写原句（答案）</w:t>
+      </w:r>
+    </w:p>
+    <w:p>
+      <w:pPr>
+        <w:spacing w:before="0" w:after="40" w:line="288" w:lineRule="auto"/>
+      </w:pPr>
+      <w:r>
+        <w:rPr>
+          <w:rFonts w:ascii="宋体" w:hAnsi="宋体" w:eastAsia="宋体"/>
+          <w:b w:val="0"/>
+          <w:color w:val="C2410C"/>
+          <w:sz w:val="22"/>
+        </w:rPr>
+        <w:t>意思：空旷的山里看不见人。</w:t>
       </w:r>
     </w:p>
     <w:p>
@@ -139,9 +153,23 @@
           <w:rFonts w:ascii="宋体" w:hAnsi="宋体" w:eastAsia="宋体"/>
           <w:b w:val="0"/>
           <w:color w:val="1C1917"/>
-          <w:sz w:val="24"/>
+          <w:sz w:val="26"/>
         </w:rPr>
-        <w:t>空山不见人，　→　空旷的山里看不见人。</w:t>
+        <w:t>原句：空山不见人，</w:t>
+      </w:r>
+    </w:p>
+    <w:p>
+      <w:pPr>
+        <w:spacing w:before="0" w:after="40" w:line="288" w:lineRule="auto"/>
+      </w:pPr>
+      <w:r>
+        <w:rPr>
+          <w:rFonts w:ascii="宋体" w:hAnsi="宋体" w:eastAsia="宋体"/>
+          <w:b w:val="0"/>
+          <w:color w:val="C2410C"/>
+          <w:sz w:val="22"/>
+        </w:rPr>
+        <w:t>意思：只听见有人说话的声音。</w:t>
       </w:r>
     </w:p>
     <w:p>
@@ -153,9 +181,23 @@
           <w:rFonts w:ascii="宋体" w:hAnsi="宋体" w:eastAsia="宋体"/>
           <w:b w:val="0"/>
           <w:color w:val="1C1917"/>
-          <w:sz w:val="24"/>
+          <w:sz w:val="26"/>
         </w:rPr>
-        <w:t>但闻人语响。　→　只听见有人说话的声音。</w:t>
+        <w:t>原句：但闻人语响。</w:t>
+      </w:r>
+    </w:p>
+    <w:p>
+      <w:pPr>
+        <w:spacing w:before="0" w:after="40" w:line="288" w:lineRule="auto"/>
+      </w:pPr>
+      <w:r>
+        <w:rPr>
+          <w:rFonts w:ascii="宋体" w:hAnsi="宋体" w:eastAsia="宋体"/>
+          <w:b w:val="0"/>
+          <w:color w:val="C2410C"/>
+          <w:sz w:val="22"/>
+        </w:rPr>
+        <w:t>意思：夕阳余光（返照）照进幽深的树林。</w:t>
       </w:r>
     </w:p>
     <w:p>
@@ -167,9 +209,23 @@
           <w:rFonts w:ascii="宋体" w:hAnsi="宋体" w:eastAsia="宋体"/>
           <w:b w:val="0"/>
           <w:color w:val="1C1917"/>
-          <w:sz w:val="24"/>
+          <w:sz w:val="26"/>
         </w:rPr>
-        <w:t>返景入深林，　→　夕阳余光（返照）照进幽深的树林。</w:t>
+        <w:t>原句：返景入深林，</w:t>
+      </w:r>
+    </w:p>
+    <w:p>
+      <w:pPr>
+        <w:spacing w:before="0" w:after="40" w:line="288" w:lineRule="auto"/>
+      </w:pPr>
+      <w:r>
+        <w:rPr>
+          <w:rFonts w:ascii="宋体" w:hAnsi="宋体" w:eastAsia="宋体"/>
+          <w:b w:val="0"/>
+          <w:color w:val="C2410C"/>
+          <w:sz w:val="22"/>
+        </w:rPr>
+        <w:t>意思：又照在青苔上面。</w:t>
       </w:r>
     </w:p>
     <w:p>
@@ -181,9 +237,9 @@
           <w:rFonts w:ascii="宋体" w:hAnsi="宋体" w:eastAsia="宋体"/>
           <w:b w:val="0"/>
           <w:color w:val="1C1917"/>
-          <w:sz w:val="24"/>
+          <w:sz w:val="26"/>
         </w:rPr>
-        <w:t>复照青苔上。　→　又照在青苔上面。</w:t>
+        <w:t>原句：复照青苔上。</w:t>
       </w:r>
     </w:p>
     <w:p>

</xml_diff>

<commit_message>
Make garden drills exam-style mastery tests with fill-ins and rewrites.
Align 日积月累 with unit-paper formats (half-line, keywords, meaning-to-sentence, U2 passage+改写); add 方以智.

Co-authored-by: Cursor <cursoragent@cursor.com>
</commit_message>
<xml_diff>
--- a/printables/garden-answers/U1-garden-answers.docx
+++ b/printables/garden-answers/U1-garden-answers.docx
@@ -14,7 +14,7 @@
           <w:color w:val="F4A261"/>
           <w:sz w:val="20"/>
         </w:rPr>
-        <w:t>语文书桌 · 园地参考答案（做完再看）</w:t>
+        <w:t>语文书桌 · 园地过关测参考答案（做完再看）</w:t>
       </w:r>
     </w:p>
     <w:p>
@@ -43,7 +43,7 @@
           <w:color w:val="E85D04"/>
           <w:sz w:val="24"/>
         </w:rPr>
-        <w:t>一、默写（全文）</w:t>
+        <w:t>一、补全名句 / 全文</w:t>
       </w:r>
     </w:p>
     <w:p>
@@ -127,7 +127,35 @@
           <w:color w:val="E85D04"/>
           <w:sz w:val="24"/>
         </w:rPr>
-        <w:t>二、根据意思写原句（答案）</w:t>
+        <w:t>二、关键词填空</w:t>
+      </w:r>
+    </w:p>
+    <w:p>
+      <w:pPr>
+        <w:spacing w:before="0" w:after="120" w:line="288" w:lineRule="auto"/>
+      </w:pPr>
+      <w:r>
+        <w:rPr>
+          <w:rFonts w:ascii="宋体" w:hAnsi="宋体" w:eastAsia="宋体"/>
+          <w:b w:val="0"/>
+          <w:color w:val="1C1917"/>
+          <w:sz w:val="24"/>
+        </w:rPr>
+        <w:t>见「一、全文」原句。</w:t>
+      </w:r>
+    </w:p>
+    <w:p>
+      <w:pPr>
+        <w:spacing w:before="160" w:after="160" w:line="288" w:lineRule="auto"/>
+      </w:pPr>
+      <w:r>
+        <w:rPr>
+          <w:rFonts w:ascii="宋体" w:hAnsi="宋体" w:eastAsia="宋体"/>
+          <w:b/>
+          <w:color w:val="E85D04"/>
+          <w:sz w:val="24"/>
+        </w:rPr>
+        <w:t>三、根据意思写原句</w:t>
       </w:r>
     </w:p>
     <w:p>
@@ -244,20 +272,6 @@
     </w:p>
     <w:p>
       <w:pPr>
-        <w:spacing w:before="0" w:after="120" w:line="288" w:lineRule="auto"/>
-      </w:pPr>
-      <w:r>
-        <w:rPr>
-          <w:rFonts w:ascii="宋体" w:hAnsi="宋体" w:eastAsia="宋体"/>
-          <w:b w:val="0"/>
-          <w:color w:val="1C1917"/>
-          <w:sz w:val="24"/>
-        </w:rPr>
-        <w:t>大意：空山里看不见人，只听见人说话的声音；夕阳余光照进深林，又照在青苔上。全诗写幽静空山：以响衬静，以光写暗。</w:t>
-      </w:r>
-    </w:p>
-    <w:p>
-      <w:pPr>
         <w:spacing w:before="160" w:after="160" w:line="288" w:lineRule="auto"/>
       </w:pPr>
       <w:r>
@@ -267,7 +281,7 @@
           <w:color w:val="E85D04"/>
           <w:sz w:val="24"/>
         </w:rPr>
-        <w:t>三、背景</w:t>
+        <w:t>背景</w:t>
       </w:r>
     </w:p>
     <w:p>

</xml_diff>

<commit_message>
Stop garden worksheets from leaking answers across sections.
Poem sheets only ask next-line completion plus meaning-to-line; quote sheets keep keyword blanks on unused lines.

Co-authored-by: Cursor <cursoragent@cursor.com>
</commit_message>
<xml_diff>
--- a/printables/garden-answers/U1-garden-answers.docx
+++ b/printables/garden-answers/U1-garden-answers.docx
@@ -127,21 +127,35 @@
           <w:color w:val="E85D04"/>
           <w:sz w:val="24"/>
         </w:rPr>
-        <w:t>二、关键词填空</w:t>
+        <w:t>一补充：下句答案</w:t>
       </w:r>
     </w:p>
     <w:p>
       <w:pPr>
-        <w:spacing w:before="0" w:after="120" w:line="288" w:lineRule="auto"/>
+        <w:spacing w:before="0" w:after="80" w:line="288" w:lineRule="auto"/>
       </w:pPr>
       <w:r>
         <w:rPr>
           <w:rFonts w:ascii="宋体" w:hAnsi="宋体" w:eastAsia="宋体"/>
           <w:b w:val="0"/>
           <w:color w:val="1C1917"/>
-          <w:sz w:val="24"/>
+          <w:sz w:val="26"/>
         </w:rPr>
-        <w:t>见「一、全文」原句。</w:t>
+        <w:t>1. 但闻人语响。</w:t>
+      </w:r>
+    </w:p>
+    <w:p>
+      <w:pPr>
+        <w:spacing w:before="0" w:after="80" w:line="288" w:lineRule="auto"/>
+      </w:pPr>
+      <w:r>
+        <w:rPr>
+          <w:rFonts w:ascii="宋体" w:hAnsi="宋体" w:eastAsia="宋体"/>
+          <w:b w:val="0"/>
+          <w:color w:val="1C1917"/>
+          <w:sz w:val="26"/>
+        </w:rPr>
+        <w:t>2. 复照青苔上。</w:t>
       </w:r>
     </w:p>
     <w:p>

</xml_diff>